<commit_message>
Updates based on SemRush audit
</commit_message>
<xml_diff>
--- a/Claude outputs/questions-still-open.docx
+++ b/Claude outputs/questions-still-open.docx
@@ -46,7 +46,7 @@
           <w:sz w:val="21"/>
           <w:szCs w:val="21"/>
         </w:rPr>
-        <w:t xml:space="preserve">Reem answered questions 1 to 20 and those are now applied to the site, so they have been removed from this list. The original numbering is kept, which is why there are gaps: a gap means that question is answered and done.</w:t>
+        <w:t xml:space="preserve">Reem answered questions 1 to 20 and those are applied to the site. Questions 21 and 22 closed on 29 October when reemglascolpc.com went live on the Worker. All of those have been removed from this list. The original numbering is kept, which is why there are gaps: a gap means that question is answered and done.</w:t>
       </w:r>
     </w:p>
     <w:p>
@@ -60,7 +60,7 @@
           <w:sz w:val="21"/>
           <w:szCs w:val="21"/>
         </w:rPr>
-        <w:t xml:space="preserve">Twenty-two questions remain. Three are new, raised by the answers themselves.</w:t>
+        <w:t xml:space="preserve">Twenty questions remain. Three are new, raised by the answers themselves.</w:t>
       </w:r>
     </w:p>
     <w:p>
@@ -438,7 +438,7 @@
           <w:sz w:val="19"/>
           <w:szCs w:val="19"/>
         </w:rPr>
-        <w:t xml:space="preserve">Psychology Today shows LPC-19014, issued 2020. Her Texas number is published on the site; the Arizona one is not, because only the state was confirmed. Arizona is now in the site’s served areas and in five rewritten telehealth answers, so the credential should either be stated in full or not claimed at all.</w:t>
+        <w:t xml:space="preserve">The Psychology Today listing showed LPC-19014, issued 2020, but that listing is being dropped, so it stops being a source anyone can check. Reem needs to supply the number directly. Her Texas number is published on the site; the Arizona one is not, because only the state was confirmed. Arizona is now in the site’s served areas and in five rewritten telehealth answers, so the credential should either be stated in full or not claimed at all.</w:t>
       </w:r>
     </w:p>
     <w:p>
@@ -476,18 +476,18 @@
           <w:sz w:val="22"/>
           <w:szCs w:val="22"/>
         </w:rPr>
-        <w:t xml:space="preserve">21.  </w:t>
-      </w:r>
-      <w:r>
-        <w:rPr>
-          <w:rFonts w:ascii="Calibri" w:cs="Calibri" w:eastAsia="Calibri" w:hAnsi="Calibri"/>
-          <w:b/>
-          <w:bCs/>
-          <w:color w:val="2A2620"/>
-          <w:sz w:val="22"/>
-          <w:szCs w:val="22"/>
-        </w:rPr>
-        <w:t xml:space="preserve">When will reemglascolpc.com point at the Worker?</w:t>
+        <w:t xml:space="preserve">23.  </w:t>
+      </w:r>
+      <w:r>
+        <w:rPr>
+          <w:rFonts w:ascii="Calibri" w:cs="Calibri" w:eastAsia="Calibri" w:hAnsi="Calibri"/>
+          <w:b/>
+          <w:bCs/>
+          <w:color w:val="2A2620"/>
+          <w:sz w:val="22"/>
+          <w:szCs w:val="22"/>
+        </w:rPr>
+        <w:t xml:space="preserve">What does the existing Google Business Profile currently say?</w:t>
       </w:r>
     </w:p>
     <w:p>
@@ -504,7 +504,7 @@
           <w:sz w:val="19"/>
           <w:szCs w:val="19"/>
         </w:rPr>
-        <w:t xml:space="preserve">Every canonical on all 29 pages, the sitemap and robots.txt already reference it. Until then the site cannot be indexed correctly. Blocks everything downstream.</w:t>
+        <w:t xml:space="preserve">The profile exists and needs updating, so this is an edit rather than a build. Four things to check. The website field, which may still point at the old WordPress site, now dead since the IONOS DNS records were deleted. The address, which was Cedar Park: switching a verified listing to a service-area business in Austin usually triggers re-verification, so expect a video. The name, which must read Finding Balance Counseling with nothing appended. The primary category, which should be Counselor. Highest-leverage single item in either audit.</w:t>
       </w:r>
     </w:p>
     <w:p>
@@ -522,18 +522,18 @@
           <w:sz w:val="22"/>
           <w:szCs w:val="22"/>
         </w:rPr>
-        <w:t xml:space="preserve">22.  </w:t>
-      </w:r>
-      <w:r>
-        <w:rPr>
-          <w:rFonts w:ascii="Calibri" w:cs="Calibri" w:eastAsia="Calibri" w:hAnsi="Calibri"/>
-          <w:b/>
-          <w:bCs/>
-          <w:color w:val="2A2620"/>
-          <w:sz w:val="22"/>
-          <w:szCs w:val="22"/>
-        </w:rPr>
-        <w:t xml:space="preserve">Can the Cloudflare build command change to npm run build:preview now?</w:t>
+        <w:t xml:space="preserve">25.  </w:t>
+      </w:r>
+      <w:r>
+        <w:rPr>
+          <w:rFonts w:ascii="Calibri" w:cs="Calibri" w:eastAsia="Calibri" w:hAnsi="Calibri"/>
+          <w:b/>
+          <w:bCs/>
+          <w:color w:val="2A2620"/>
+          <w:sz w:val="22"/>
+          <w:szCs w:val="22"/>
+        </w:rPr>
+        <w:t xml:space="preserve">Which directories is the practice already listed in?</w:t>
       </w:r>
     </w:p>
     <w:p>
@@ -550,99 +550,7 @@
           <w:sz w:val="19"/>
           <w:szCs w:val="19"/>
         </w:rPr>
-        <w:t xml:space="preserve">It is currently npm run build, so the preview publishes an indexable build that canonicals to the dead domain. More urgent than before: a production build now strips the working notes, so running the wrong command on the preview host hides the very annotations the preview exists to show.</w:t>
-      </w:r>
-    </w:p>
-    <w:p>
-      <w:pPr>
-        <w:keepNext/>
-        <w:spacing w:after="40" w:before="200"/>
-        <w:ind w:left="470" w:hanging="470"/>
-      </w:pPr>
-      <w:r>
-        <w:rPr>
-          <w:rFonts w:ascii="Calibri" w:cs="Calibri" w:eastAsia="Calibri" w:hAnsi="Calibri"/>
-          <w:b/>
-          <w:bCs/>
-          <w:color w:val="7A5C1F"/>
-          <w:sz w:val="22"/>
-          <w:szCs w:val="22"/>
-        </w:rPr>
-        <w:t xml:space="preserve">23.  </w:t>
-      </w:r>
-      <w:r>
-        <w:rPr>
-          <w:rFonts w:ascii="Calibri" w:cs="Calibri" w:eastAsia="Calibri" w:hAnsi="Calibri"/>
-          <w:b/>
-          <w:bCs/>
-          <w:color w:val="2A2620"/>
-          <w:sz w:val="22"/>
-          <w:szCs w:val="22"/>
-        </w:rPr>
-        <w:t xml:space="preserve">Can a Google Business Profile be created?</w:t>
-      </w:r>
-    </w:p>
-    <w:p>
-      <w:pPr>
-        <w:spacing w:after="60" w:line="264"/>
-        <w:ind w:left="470"/>
-      </w:pPr>
-      <w:r>
-        <w:rPr>
-          <w:rFonts w:ascii="Calibri" w:cs="Calibri" w:eastAsia="Calibri" w:hAnsi="Calibri"/>
-          <w:i/>
-          <w:iCs/>
-          <w:color w:val="5C5346"/>
-          <w:sz w:val="19"/>
-          <w:szCs w:val="19"/>
-        </w:rPr>
-        <w:t xml:space="preserve">Highest-leverage single item in either audit, and now unblocked: the practice is a service-area business with no address clients visit, so the profile is created with a service area and no displayed street address. Austin, not Cedar Park.</w:t>
-      </w:r>
-    </w:p>
-    <w:p>
-      <w:pPr>
-        <w:keepNext/>
-        <w:spacing w:after="40" w:before="200"/>
-        <w:ind w:left="470" w:hanging="470"/>
-      </w:pPr>
-      <w:r>
-        <w:rPr>
-          <w:rFonts w:ascii="Calibri" w:cs="Calibri" w:eastAsia="Calibri" w:hAnsi="Calibri"/>
-          <w:b/>
-          <w:bCs/>
-          <w:color w:val="7A5C1F"/>
-          <w:sz w:val="22"/>
-          <w:szCs w:val="22"/>
-        </w:rPr>
-        <w:t xml:space="preserve">25.  </w:t>
-      </w:r>
-      <w:r>
-        <w:rPr>
-          <w:rFonts w:ascii="Calibri" w:cs="Calibri" w:eastAsia="Calibri" w:hAnsi="Calibri"/>
-          <w:b/>
-          <w:bCs/>
-          <w:color w:val="2A2620"/>
-          <w:sz w:val="22"/>
-          <w:szCs w:val="22"/>
-        </w:rPr>
-        <w:t xml:space="preserve">Which directories is the practice already listed in?</w:t>
-      </w:r>
-    </w:p>
-    <w:p>
-      <w:pPr>
-        <w:spacing w:after="60" w:line="264"/>
-        <w:ind w:left="470"/>
-      </w:pPr>
-      <w:r>
-        <w:rPr>
-          <w:rFonts w:ascii="Calibri" w:cs="Calibri" w:eastAsia="Calibri" w:hAnsi="Calibri"/>
-          <w:i/>
-          <w:iCs/>
-          <w:color w:val="5C5346"/>
-          <w:sz w:val="19"/>
-          <w:szCs w:val="19"/>
-        </w:rPr>
-        <w:t xml:space="preserve">Psychology Today is confirmed and linked. Still to check: the EMDRIA consultant directory, NARM Training Institute, Somatic Experiencing International, TherapyDen, GoodTherapy. EMDRIA’s directory already ranks page one for “emdr consultation”, which Reem’s own page never will.</w:t>
+        <w:t xml:space="preserve">Psychology Today is out: the listing is being dropped, so the link and the schema sameAs have been removed from the site. That leaves the Person schema with no external identity link at all. Still to check: the EMDRIA consultant directory, NARM Training Institute, Somatic Experiencing International, TherapyDen, GoodTherapy. EMDRIA’s directory already ranks page one for “emdr consultation”, which Reem’s own page never will, and whichever of these is live should take over the sameAs slot.</w:t>
       </w:r>
     </w:p>
     <w:p>
@@ -1497,7 +1405,7 @@
           <w:sz w:val="28"/>
           <w:szCs w:val="28"/>
         </w:rPr>
-        <w:t xml:space="preserve">The four that block the most</w:t>
+        <w:t xml:space="preserve">The three that block the most</w:t>
       </w:r>
     </w:p>
     <w:tbl>
@@ -1618,7 +1526,7 @@
                 <w:sz w:val="19"/>
                 <w:szCs w:val="19"/>
               </w:rPr>
-              <w:t xml:space="preserve">21</w:t>
+              <w:t xml:space="preserve">23</w:t>
             </w:r>
           </w:p>
         </w:tc>
@@ -1642,7 +1550,7 @@
                 <w:sz w:val="19"/>
                 <w:szCs w:val="19"/>
               </w:rPr>
-              <w:t xml:space="preserve">Domain pointed at the Worker</w:t>
+              <w:t xml:space="preserve">Google Business Profile update</w:t>
             </w:r>
           </w:p>
         </w:tc>
@@ -1692,7 +1600,7 @@
                 <w:sz w:val="19"/>
                 <w:szCs w:val="19"/>
               </w:rPr>
-              <w:t xml:space="preserve">22</w:t>
+              <w:t xml:space="preserve">28</w:t>
             </w:r>
           </w:p>
         </w:tc>
@@ -1716,81 +1624,7 @@
                 <w:sz w:val="19"/>
                 <w:szCs w:val="19"/>
               </w:rPr>
-              <w:t xml:space="preserve">Cloudflare build command</w:t>
-            </w:r>
-          </w:p>
-        </w:tc>
-        <w:tc>
-          <w:tcPr>
-            <w:tcW w:type="dxa" w:w="1640"/>
-            <w:tcMar>
-              <w:top w:type="dxa" w:w="90"/>
-              <w:left w:type="dxa" w:w="120"/>
-              <w:bottom w:type="dxa" w:w="90"/>
-              <w:right w:type="dxa" w:w="120"/>
-            </w:tcMar>
-          </w:tcPr>
-          <w:p>
-            <w:r>
-              <w:rPr>
-                <w:rFonts w:ascii="Calibri" w:cs="Calibri" w:eastAsia="Calibri" w:hAnsi="Calibri"/>
-                <w:b w:val="false"/>
-                <w:bCs w:val="false"/>
-                <w:color w:val="2A2620"/>
-                <w:sz w:val="19"/>
-                <w:szCs w:val="19"/>
-              </w:rPr>
-              <w:t xml:space="preserve">Dave</w:t>
-            </w:r>
-          </w:p>
-        </w:tc>
-      </w:tr>
-      <w:tr>
-        <w:tc>
-          <w:tcPr>
-            <w:tcW w:type="dxa" w:w="760"/>
-            <w:tcMar>
-              <w:top w:type="dxa" w:w="90"/>
-              <w:left w:type="dxa" w:w="120"/>
-              <w:bottom w:type="dxa" w:w="90"/>
-              <w:right w:type="dxa" w:w="120"/>
-            </w:tcMar>
-          </w:tcPr>
-          <w:p>
-            <w:r>
-              <w:rPr>
-                <w:rFonts w:ascii="Calibri" w:cs="Calibri" w:eastAsia="Calibri" w:hAnsi="Calibri"/>
-                <w:b/>
-                <w:bCs/>
-                <w:color w:val="7A5C1F"/>
-                <w:sz w:val="19"/>
-                <w:szCs w:val="19"/>
-              </w:rPr>
-              <w:t xml:space="preserve">23</w:t>
-            </w:r>
-          </w:p>
-        </w:tc>
-        <w:tc>
-          <w:tcPr>
-            <w:tcW w:type="dxa" w:w="6400"/>
-            <w:tcMar>
-              <w:top w:type="dxa" w:w="90"/>
-              <w:left w:type="dxa" w:w="120"/>
-              <w:bottom w:type="dxa" w:w="90"/>
-              <w:right w:type="dxa" w:w="120"/>
-            </w:tcMar>
-          </w:tcPr>
-          <w:p>
-            <w:r>
-              <w:rPr>
-                <w:rFonts w:ascii="Calibri" w:cs="Calibri" w:eastAsia="Calibri" w:hAnsi="Calibri"/>
-                <w:b w:val="false"/>
-                <w:bCs w:val="false"/>
-                <w:color w:val="2A2620"/>
-                <w:sz w:val="19"/>
-                <w:szCs w:val="19"/>
-              </w:rPr>
-              <w:t xml:space="preserve">Google Business Profile</w:t>
+              <w:t xml:space="preserve">Intake PDFs off the old site</w:t>
             </w:r>
           </w:p>
         </w:tc>
@@ -1907,7 +1741,7 @@
           <w:sz w:val="19"/>
           <w:szCs w:val="19"/>
         </w:rPr>
-        <w:t xml:space="preserve">21 and 22 are blocking correctness. 23 and 31 decide what the next quarter of work should be. Question 1 has dropped off this list because it is answered and the site now says three plus one everywhere.</w:t>
+        <w:t xml:space="preserve">28 moved up because the old WordPress site stopped resolving when the IONOS DNS records were deleted, so the five intake PDFs and the privacy policy now have to come off the host rather than the web. 23 and 31 decide what the next quarter of work should be.</w:t>
       </w:r>
     </w:p>
     <w:sectPr>

</xml_diff>

<commit_message>
Removed references to old site, added more blog entries, make equine a first class offering
</commit_message>
<xml_diff>
--- a/Claude outputs/questions-still-open.docx
+++ b/Claude outputs/questions-still-open.docx
@@ -60,7 +60,7 @@
           <w:sz w:val="21"/>
           <w:szCs w:val="21"/>
         </w:rPr>
-        <w:t xml:space="preserve">Twenty questions remain. Three are new, raised by the answers themselves.</w:t>
+        <w:t xml:space="preserve">Nineteen questions remain. One of them, the retreat deposit, was raised by the answers themselves.</w:t>
       </w:r>
     </w:p>
     <w:p>
@@ -317,53 +317,6 @@
           <w:sz w:val="22"/>
           <w:szCs w:val="22"/>
         </w:rPr>
-        <w:t xml:space="preserve">41.  </w:t>
-      </w:r>
-      <w:r>
-        <w:rPr>
-          <w:rFonts w:ascii="Calibri" w:cs="Calibri" w:eastAsia="Calibri" w:hAnsi="Calibri"/>
-          <w:b/>
-          <w:bCs/>
-          <w:color w:val="2A2620"/>
-          <w:sz w:val="22"/>
-          <w:szCs w:val="22"/>
-        </w:rPr>
-        <w:t xml:space="preserve">The trail walk price does not match the site. Which is right?</w:t>
-      </w:r>
-    </w:p>
-    <w:p>
-      <w:pPr>
-        <w:pBdr>
-          <w:left w:val="single" w:color="7A5C1F" w:sz="18" w:space="12"/>
-        </w:pBdr>
-        <w:spacing w:after="120" w:before="120" w:line="264"/>
-        <w:ind w:left="470"/>
-      </w:pPr>
-      <w:r>
-        <w:rPr>
-          <w:rFonts w:ascii="Calibri" w:cs="Calibri" w:eastAsia="Calibri" w:hAnsi="Calibri"/>
-          <w:color w:val="2A2620"/>
-          <w:sz w:val="19"/>
-          <w:szCs w:val="19"/>
-        </w:rPr>
-        <w:t xml:space="preserve">You said $125 for one hour for a mindful trail walk. The site says $240 to $370 for a session of 75 minutes to two hours, in fifteen places across seven pages — and when this came up against the Psychology Today listing, Dave said to use the site. Either these are two different offerings that both need naming, or one price is wrong. Nothing has been changed either way.</w:t>
-      </w:r>
-    </w:p>
-    <w:p>
-      <w:pPr>
-        <w:keepNext/>
-        <w:spacing w:after="40" w:before="200"/>
-        <w:ind w:left="470" w:hanging="470"/>
-      </w:pPr>
-      <w:r>
-        <w:rPr>
-          <w:rFonts w:ascii="Calibri" w:cs="Calibri" w:eastAsia="Calibri" w:hAnsi="Calibri"/>
-          <w:b/>
-          <w:bCs/>
-          <w:color w:val="7A5C1F"/>
-          <w:sz w:val="22"/>
-          <w:szCs w:val="22"/>
-        </w:rPr>
         <w:t xml:space="preserve">42.  </w:t>
       </w:r>
       <w:r>
@@ -1381,6 +1334,141 @@
           <w:szCs w:val="19"/>
         </w:rPr>
         <w:t xml:space="preserve">The roster can be published.</w:t>
+      </w:r>
+    </w:p>
+    <w:p>
+      <w:pPr>
+        <w:spacing w:after="30" w:before="140"/>
+        <w:ind w:left="470" w:hanging="470"/>
+      </w:pPr>
+      <w:r>
+        <w:rPr>
+          <w:rFonts w:ascii="Calibri" w:cs="Calibri" w:eastAsia="Calibri" w:hAnsi="Calibri"/>
+          <w:b/>
+          <w:bCs/>
+          <w:color w:val="7A5C1F"/>
+          <w:sz w:val="21"/>
+          <w:szCs w:val="21"/>
+        </w:rPr>
+        <w:t xml:space="preserve">✓  </w:t>
+      </w:r>
+      <w:r>
+        <w:rPr>
+          <w:rFonts w:ascii="Calibri" w:cs="Calibri" w:eastAsia="Calibri" w:hAnsi="Calibri"/>
+          <w:b/>
+          <w:bCs/>
+          <w:color w:val="2A2620"/>
+          <w:sz w:val="21"/>
+          <w:szCs w:val="21"/>
+        </w:rPr>
+        <w:t xml:space="preserve">Trail walk is $125 for one hour</w:t>
+      </w:r>
+    </w:p>
+    <w:p>
+      <w:pPr>
+        <w:spacing w:after="40" w:line="264"/>
+        <w:ind w:left="470"/>
+      </w:pPr>
+      <w:r>
+        <w:rPr>
+          <w:rFonts w:ascii="Calibri" w:cs="Calibri" w:eastAsia="Calibri" w:hAnsi="Calibri"/>
+          <w:i/>
+          <w:iCs/>
+          <w:color w:val="5C5346"/>
+          <w:sz w:val="19"/>
+          <w:szCs w:val="19"/>
+        </w:rPr>
+        <w:t xml:space="preserve">Replaces the inherited $240 to $370 for 75 minutes to two hours, corrected in fifteen places across seven pages plus the Service schema and llms.txt.</w:t>
+      </w:r>
+    </w:p>
+    <w:p>
+      <w:pPr>
+        <w:spacing w:after="30" w:before="140"/>
+        <w:ind w:left="470" w:hanging="470"/>
+      </w:pPr>
+      <w:r>
+        <w:rPr>
+          <w:rFonts w:ascii="Calibri" w:cs="Calibri" w:eastAsia="Calibri" w:hAnsi="Calibri"/>
+          <w:b/>
+          <w:bCs/>
+          <w:color w:val="7A5C1F"/>
+          <w:sz w:val="21"/>
+          <w:szCs w:val="21"/>
+        </w:rPr>
+        <w:t xml:space="preserve">✓  </w:t>
+      </w:r>
+      <w:r>
+        <w:rPr>
+          <w:rFonts w:ascii="Calibri" w:cs="Calibri" w:eastAsia="Calibri" w:hAnsi="Calibri"/>
+          <w:b/>
+          <w:bCs/>
+          <w:color w:val="2A2620"/>
+          <w:sz w:val="21"/>
+          <w:szCs w:val="21"/>
+        </w:rPr>
+        <w:t xml:space="preserve">Insurance does not cover equine sessions</w:t>
+      </w:r>
+    </w:p>
+    <w:p>
+      <w:pPr>
+        <w:spacing w:after="40" w:line="264"/>
+        <w:ind w:left="470"/>
+      </w:pPr>
+      <w:r>
+        <w:rPr>
+          <w:rFonts w:ascii="Calibri" w:cs="Calibri" w:eastAsia="Calibri" w:hAnsi="Calibri"/>
+          <w:i/>
+          <w:iCs/>
+          <w:color w:val="5C5346"/>
+          <w:sz w:val="19"/>
+          <w:szCs w:val="19"/>
+        </w:rPr>
+        <w:t xml:space="preserve">Stated plainly on the equine page and in a new post answering the question, which is roughly 350 searches a month at difficulty 7 to 12.</w:t>
+      </w:r>
+    </w:p>
+    <w:p>
+      <w:pPr>
+        <w:spacing w:after="30" w:before="140"/>
+        <w:ind w:left="470" w:hanging="470"/>
+      </w:pPr>
+      <w:r>
+        <w:rPr>
+          <w:rFonts w:ascii="Calibri" w:cs="Calibri" w:eastAsia="Calibri" w:hAnsi="Calibri"/>
+          <w:b/>
+          <w:bCs/>
+          <w:color w:val="7A5C1F"/>
+          <w:sz w:val="21"/>
+          <w:szCs w:val="21"/>
+        </w:rPr>
+        <w:t xml:space="preserve">✓  </w:t>
+      </w:r>
+      <w:r>
+        <w:rPr>
+          <w:rFonts w:ascii="Calibri" w:cs="Calibri" w:eastAsia="Calibri" w:hAnsi="Calibri"/>
+          <w:b/>
+          <w:bCs/>
+          <w:color w:val="2A2620"/>
+          <w:sz w:val="21"/>
+          <w:szCs w:val="21"/>
+        </w:rPr>
+        <w:t xml:space="preserve">Psychology Today is dropped</w:t>
+      </w:r>
+    </w:p>
+    <w:p>
+      <w:pPr>
+        <w:spacing w:after="40" w:line="264"/>
+        <w:ind w:left="470"/>
+      </w:pPr>
+      <w:r>
+        <w:rPr>
+          <w:rFonts w:ascii="Calibri" w:cs="Calibri" w:eastAsia="Calibri" w:hAnsi="Calibri"/>
+          <w:i/>
+          <w:iCs/>
+          <w:color w:val="5C5346"/>
+          <w:sz w:val="19"/>
+          <w:szCs w:val="19"/>
+        </w:rPr>
+        <w:t xml:space="preserve">Link and schema sameAs removed. The Person schema now has no external identity link until a directory listing replaces it.</w:t>
       </w:r>
     </w:p>
     <w:p>

</xml_diff>

<commit_message>
Cleanup email form and removed portal references
</commit_message>
<xml_diff>
--- a/Claude outputs/questions-still-open.docx
+++ b/Claude outputs/questions-still-open.docx
@@ -32,7 +32,7 @@
           <w:sz w:val="20"/>
           <w:szCs w:val="20"/>
         </w:rPr>
-        <w:t xml:space="preserve">Finding Balance Counseling  ·  Reem Glasco, LPC-S  ·  Updated 29 October 2026</w:t>
+        <w:t xml:space="preserve">Finding Balance Counseling  ·  Reem Glasco, LPC-S  ·  Updated 30 October 2026</w:t>
       </w:r>
     </w:p>
     <w:p>
@@ -46,7 +46,7 @@
           <w:sz w:val="21"/>
           <w:szCs w:val="21"/>
         </w:rPr>
-        <w:t xml:space="preserve">Fifteen questions remain. The original numbering is kept, so a gap means that question is answered and done. Items marked NEW were raised by the work since the last version.</w:t>
+        <w:t xml:space="preserve">Nineteen questions remain. The original numbering is kept, so a gap means that question is answered and done. Items marked NEW were raised by the work since the last version.</w:t>
       </w:r>
     </w:p>
     <w:p>
@@ -60,7 +60,7 @@
           <w:sz w:val="21"/>
           <w:szCs w:val="21"/>
         </w:rPr>
-        <w:t xml:space="preserve">Closed since the last list: 16 (the CE provider question, settled by the rule itself), 38 and 40 (Arizona, now removed from the site), 36 (the blog is promoted to the main navigation), 31, 32 and 35 (settled by the positioning decision), 39 (the Austin postcode is 78726, now on the site and in the schema), and most of 25 and 28.</w:t>
+        <w:t xml:space="preserve">Closed since the last list: 27, settled by the decision to drop the client portal from the site entirely rather than by finding the URL; 29, now that Reem’s portrait is on the About page and all six associates have photographs; and the question of how many years of clinical experience the site should claim, which stays as written. 42 is not closed but is reframed, because it used to depend on 27.</w:t>
       </w:r>
     </w:p>
     <w:p>
@@ -97,7 +97,7 @@
           <w:sz w:val="22"/>
           <w:szCs w:val="22"/>
         </w:rPr>
-        <w:t xml:space="preserve">Still outstanding</w:t>
+        <w:t xml:space="preserve">Two that are waiting on her right now</w:t>
       </w:r>
     </w:p>
     <w:p>
@@ -115,18 +115,18 @@
           <w:sz w:val="22"/>
           <w:szCs w:val="22"/>
         </w:rPr>
-        <w:t xml:space="preserve">5.  </w:t>
-      </w:r>
-      <w:r>
-        <w:rPr>
-          <w:rFonts w:ascii="Calibri" w:cs="Calibri" w:eastAsia="Calibri" w:hAnsi="Calibri"/>
-          <w:b/>
-          <w:bCs/>
-          <w:color w:val="2A2620"/>
-          <w:sz w:val="22"/>
-          <w:szCs w:val="22"/>
-        </w:rPr>
-        <w:t xml:space="preserve">What is Emmy Laursen’s session fee?</w:t>
+        <w:t xml:space="preserve">52.  </w:t>
+      </w:r>
+      <w:r>
+        <w:rPr>
+          <w:rFonts w:ascii="Calibri" w:cs="Calibri" w:eastAsia="Calibri" w:hAnsi="Calibri"/>
+          <w:b/>
+          <w:bCs/>
+          <w:color w:val="2A2620"/>
+          <w:sz w:val="22"/>
+          <w:szCs w:val="22"/>
+        </w:rPr>
+        <w:t xml:space="preserve">Which email address should client-facing pages use?</w:t>
       </w:r>
     </w:p>
     <w:p>
@@ -143,7 +143,7 @@
           <w:sz w:val="19"/>
           <w:szCs w:val="19"/>
         </w:rPr>
-        <w:t xml:space="preserve">She is the only associate whose card reads “Ask in the consult” in both columns. The rest of the roster now reads $100 to $150.</w:t>
+        <w:t xml:space="preserve">NEW. The “Email Reem” button sits on 26 pages, including every therapy page, and currently points at the supervision address, which is a personal Gmail. A prospective client reading the trauma page and clicking it writes to a personal inbox rather than to info@findingbalancecounselingpllc.com. Two problems in one button: enquiries land in the wrong place, and a personal Gmail is the wrong intake channel for whatever a distressed person might put in a first message. The fix is ready to apply as soon as the address is settled: client-facing pages route to the practice address, therapist-facing pages keep the supervision one.</w:t>
       </w:r>
     </w:p>
     <w:p>
@@ -161,18 +161,18 @@
           <w:sz w:val="22"/>
           <w:szCs w:val="22"/>
         </w:rPr>
-        <w:t xml:space="preserve">14.  </w:t>
-      </w:r>
-      <w:r>
-        <w:rPr>
-          <w:rFonts w:ascii="Calibri" w:cs="Calibri" w:eastAsia="Calibri" w:hAnsi="Calibri"/>
-          <w:b/>
-          <w:bCs/>
-          <w:color w:val="2A2620"/>
-          <w:sz w:val="22"/>
-          <w:szCs w:val="22"/>
-        </w:rPr>
-        <w:t xml:space="preserve">What is the next retreat date, format and fee?</w:t>
+        <w:t xml:space="preserve">53.  </w:t>
+      </w:r>
+      <w:r>
+        <w:rPr>
+          <w:rFonts w:ascii="Calibri" w:cs="Calibri" w:eastAsia="Calibri" w:hAnsi="Calibri"/>
+          <w:b/>
+          <w:bCs/>
+          <w:color w:val="2A2620"/>
+          <w:sz w:val="22"/>
+          <w:szCs w:val="22"/>
+        </w:rPr>
+        <w:t xml:space="preserve">Is the Hushmail account from the old site still active, and what does it cost?</w:t>
       </w:r>
     </w:p>
     <w:p>
@@ -189,237 +189,7 @@
           <w:sz w:val="19"/>
           <w:szCs w:val="19"/>
         </w:rPr>
-        <w:t xml:space="preserve">Still blank. The retreats page sends people to the contact form instead of letting them book.</w:t>
-      </w:r>
-    </w:p>
-    <w:p>
-      <w:pPr>
-        <w:keepNext/>
-        <w:spacing w:after="40" w:before="200"/>
-        <w:ind w:left="470" w:hanging="470"/>
-      </w:pPr>
-      <w:r>
-        <w:rPr>
-          <w:rFonts w:ascii="Calibri" w:cs="Calibri" w:eastAsia="Calibri" w:hAnsi="Calibri"/>
-          <w:b/>
-          <w:bCs/>
-          <w:color w:val="7A5C1F"/>
-          <w:sz w:val="22"/>
-          <w:szCs w:val="22"/>
-        </w:rPr>
-        <w:t xml:space="preserve">15.  </w:t>
-      </w:r>
-      <w:r>
-        <w:rPr>
-          <w:rFonts w:ascii="Calibri" w:cs="Calibri" w:eastAsia="Calibri" w:hAnsi="Calibri"/>
-          <w:b/>
-          <w:bCs/>
-          <w:color w:val="2A2620"/>
-          <w:sz w:val="22"/>
-          <w:szCs w:val="22"/>
-        </w:rPr>
-        <w:t xml:space="preserve">What is the next ethics CEU offering — date and fee?</w:t>
-      </w:r>
-    </w:p>
-    <w:p>
-      <w:pPr>
-        <w:spacing w:after="60" w:line="264"/>
-        <w:ind w:left="470"/>
-      </w:pPr>
-      <w:r>
-        <w:rPr>
-          <w:rFonts w:ascii="Calibri" w:cs="Calibri" w:eastAsia="Calibri" w:hAnsi="Calibri"/>
-          <w:i/>
-          <w:iCs/>
-          <w:color w:val="5C5346"/>
-          <w:sz w:val="19"/>
-          <w:szCs w:val="19"/>
-        </w:rPr>
-        <w:t xml:space="preserve">Same page, same problem. This is now the only thing standing between that page and a working Course listing in its structured data, which needs a date and a price to validate.</w:t>
-      </w:r>
-    </w:p>
-    <w:p>
-      <w:pPr>
-        <w:keepNext/>
-        <w:spacing w:after="40" w:before="200"/>
-        <w:ind w:left="470" w:hanging="470"/>
-      </w:pPr>
-      <w:r>
-        <w:rPr>
-          <w:rFonts w:ascii="Calibri" w:cs="Calibri" w:eastAsia="Calibri" w:hAnsi="Calibri"/>
-          <w:b/>
-          <w:bCs/>
-          <w:color w:val="7A5C1F"/>
-          <w:sz w:val="22"/>
-          <w:szCs w:val="22"/>
-        </w:rPr>
-        <w:t xml:space="preserve">42.  </w:t>
-      </w:r>
-      <w:r>
-        <w:rPr>
-          <w:rFonts w:ascii="Calibri" w:cs="Calibri" w:eastAsia="Calibri" w:hAnsi="Calibri"/>
-          <w:b/>
-          <w:bCs/>
-          <w:color w:val="2A2620"/>
-          <w:sz w:val="22"/>
-          <w:szCs w:val="22"/>
-        </w:rPr>
-        <w:t xml:space="preserve">How should the $85 retreat deposit be collected?</w:t>
-      </w:r>
-    </w:p>
-    <w:p>
-      <w:pPr>
-        <w:spacing w:after="60" w:line="264"/>
-        <w:ind w:left="470"/>
-      </w:pPr>
-      <w:r>
-        <w:rPr>
-          <w:rFonts w:ascii="Calibri" w:cs="Calibri" w:eastAsia="Calibri" w:hAnsi="Calibri"/>
-          <w:i/>
-          <w:iCs/>
-          <w:color w:val="5C5346"/>
-          <w:sz w:val="19"/>
-          <w:szCs w:val="19"/>
-        </w:rPr>
-        <w:t xml:space="preserve">A registration page needs a payment route, a written refund policy and a receipt trail. It is a build, not a copy change, and it probably belongs inside the client portal. Depends on question 27.</w:t>
-      </w:r>
-    </w:p>
-    <w:p>
-      <w:pPr>
-        <w:pStyle w:val="Heading2"/>
-        <w:spacing w:after="110" w:before="270"/>
-      </w:pPr>
-      <w:r>
-        <w:rPr>
-          <w:rFonts w:ascii="Calibri" w:cs="Calibri" w:eastAsia="Calibri" w:hAnsi="Calibri"/>
-          <w:b/>
-          <w:bCs/>
-          <w:color w:val="7A5C1F"/>
-          <w:sz w:val="22"/>
-          <w:szCs w:val="22"/>
-        </w:rPr>
-        <w:t xml:space="preserve">New, from this week’s work</w:t>
-      </w:r>
-    </w:p>
-    <w:p>
-      <w:pPr>
-        <w:keepNext/>
-        <w:spacing w:after="40" w:before="200"/>
-        <w:ind w:left="470" w:hanging="470"/>
-      </w:pPr>
-      <w:r>
-        <w:rPr>
-          <w:rFonts w:ascii="Calibri" w:cs="Calibri" w:eastAsia="Calibri" w:hAnsi="Calibri"/>
-          <w:b/>
-          <w:bCs/>
-          <w:color w:val="7A5C1F"/>
-          <w:sz w:val="22"/>
-          <w:szCs w:val="22"/>
-        </w:rPr>
-        <w:t xml:space="preserve">43.  </w:t>
-      </w:r>
-      <w:r>
-        <w:rPr>
-          <w:rFonts w:ascii="Calibri" w:cs="Calibri" w:eastAsia="Calibri" w:hAnsi="Calibri"/>
-          <w:b/>
-          <w:bCs/>
-          <w:color w:val="2A2620"/>
-          <w:sz w:val="22"/>
-          <w:szCs w:val="22"/>
-        </w:rPr>
-        <w:t xml:space="preserve">Is the online ethics CEU delivered live, or as a recording?</w:t>
-      </w:r>
-    </w:p>
-    <w:p>
-      <w:pPr>
-        <w:spacing w:after="60" w:line="264"/>
-        <w:ind w:left="470"/>
-      </w:pPr>
-      <w:r>
-        <w:rPr>
-          <w:rFonts w:ascii="Calibri" w:cs="Calibri" w:eastAsia="Calibri" w:hAnsi="Calibri"/>
-          <w:i/>
-          <w:iCs/>
-          <w:color w:val="5C5346"/>
-          <w:sz w:val="19"/>
-          <w:szCs w:val="19"/>
-        </w:rPr>
-        <w:t xml:space="preserve">NEW. Under 22 TAC §681.140(h) self-study is capped at one hour per renewal period, and a recording counts as self-study while a live session does not. The site now advises readers to ask this of any online CE. It should be able to answer it about Reem’s own.</w:t>
-      </w:r>
-    </w:p>
-    <w:p>
-      <w:pPr>
-        <w:keepNext/>
-        <w:spacing w:after="40" w:before="200"/>
-        <w:ind w:left="470" w:hanging="470"/>
-      </w:pPr>
-      <w:r>
-        <w:rPr>
-          <w:rFonts w:ascii="Calibri" w:cs="Calibri" w:eastAsia="Calibri" w:hAnsi="Calibri"/>
-          <w:b/>
-          <w:bCs/>
-          <w:color w:val="7A5C1F"/>
-          <w:sz w:val="22"/>
-          <w:szCs w:val="22"/>
-        </w:rPr>
-        <w:t xml:space="preserve">44.  </w:t>
-      </w:r>
-      <w:r>
-        <w:rPr>
-          <w:rFonts w:ascii="Calibri" w:cs="Calibri" w:eastAsia="Calibri" w:hAnsi="Calibri"/>
-          <w:b/>
-          <w:bCs/>
-          <w:color w:val="2A2620"/>
-          <w:sz w:val="22"/>
-          <w:szCs w:val="22"/>
-        </w:rPr>
-        <w:t xml:space="preserve">Does the practice issue superbills for equine clients?</w:t>
-      </w:r>
-    </w:p>
-    <w:p>
-      <w:pPr>
-        <w:spacing w:after="60" w:line="264"/>
-        <w:ind w:left="470"/>
-      </w:pPr>
-      <w:r>
-        <w:rPr>
-          <w:rFonts w:ascii="Calibri" w:cs="Calibri" w:eastAsia="Calibri" w:hAnsi="Calibri"/>
-          <w:i/>
-          <w:iCs/>
-          <w:color w:val="5C5346"/>
-          <w:sz w:val="19"/>
-          <w:szCs w:val="19"/>
-        </w:rPr>
-        <w:t xml:space="preserve">NEW. The new post states plainly that equine sessions are not billed to insurance. If clients can still claim out of network with a superbill, that changes the answer usefully for a lot of people.</w:t>
-      </w:r>
-    </w:p>
-    <w:p>
-      <w:pPr>
-        <w:keepNext/>
-        <w:spacing w:after="40" w:before="200"/>
-        <w:ind w:left="470" w:hanging="470"/>
-      </w:pPr>
-      <w:r>
-        <w:rPr>
-          <w:rFonts w:ascii="Calibri" w:cs="Calibri" w:eastAsia="Calibri" w:hAnsi="Calibri"/>
-          <w:b/>
-          <w:bCs/>
-          <w:color w:val="7A5C1F"/>
-          <w:sz w:val="22"/>
-          <w:szCs w:val="22"/>
-        </w:rPr>
-        <w:t xml:space="preserve">45.  </w:t>
-      </w:r>
-      <w:r>
-        <w:rPr>
-          <w:rFonts w:ascii="Calibri" w:cs="Calibri" w:eastAsia="Calibri" w:hAnsi="Calibri"/>
-          <w:b/>
-          <w:bCs/>
-          <w:color w:val="2A2620"/>
-          <w:sz w:val="22"/>
-          <w:szCs w:val="22"/>
-        </w:rPr>
-        <w:t xml:space="preserve">Sign off the rebuilt Good Faith Estimate.</w:t>
+        <w:t xml:space="preserve">NEW. The old site used Hushmail. Three things follow from the answer. Whether the practice is still paying for something unused. Whether a secure intake form should replace the current appointment form, which builds an ordinary email and receives nothing. And whether Hushmail is needed at all, because if the practice ends up on SimplePractice or TherapyNotes, both include HIPAA intake forms and a signed BAA in the base subscription, and paying Hushmail separately would buy the same capability twice.</w:t>
       </w:r>
     </w:p>
     <w:p>
@@ -437,7 +207,24 @@
           <w:sz w:val="19"/>
           <w:szCs w:val="19"/>
         </w:rPr>
-        <w:t xml:space="preserve">Rebuilt at $240 per 50-minute session, with trail walk and equine added, the EIN removed, the date range left blank to fill per client, and the No Surprises Act dispute-rights section added, which the old one lacked entirely. One item needs her judgment rather than mine: the CPT code. The old document said 90837 in its header and 90834 in its body. 90834 covers 38 to 52 minutes, which is what a 50-minute session is, so that is what I used. It is a billing decision.</w:t>
+        <w:t xml:space="preserve">Nothing on the site is a privacy problem today. The appointment form has no server behind it: it composes a message in the visitor’s own mail app and nothing is transmitted or stored. It now warns, twice, against putting any personal or clinical information in it. The question is what intake should look like once a client starts writing real detail.</w:t>
+      </w:r>
+    </w:p>
+    <w:p>
+      <w:pPr>
+        <w:pStyle w:val="Heading2"/>
+        <w:spacing w:after="110" w:before="270"/>
+      </w:pPr>
+      <w:r>
+        <w:rPr>
+          <w:rFonts w:ascii="Calibri" w:cs="Calibri" w:eastAsia="Calibri" w:hAnsi="Calibri"/>
+          <w:b/>
+          <w:bCs/>
+          <w:color w:val="7A5C1F"/>
+          <w:sz w:val="22"/>
+          <w:szCs w:val="22"/>
+        </w:rPr>
+        <w:t xml:space="preserve">Still outstanding</w:t>
       </w:r>
     </w:p>
     <w:p>
@@ -455,18 +242,18 @@
           <w:sz w:val="22"/>
           <w:szCs w:val="22"/>
         </w:rPr>
-        <w:t xml:space="preserve">46.  </w:t>
-      </w:r>
-      <w:r>
-        <w:rPr>
-          <w:rFonts w:ascii="Calibri" w:cs="Calibri" w:eastAsia="Calibri" w:hAnsi="Calibri"/>
-          <w:b/>
-          <w:bCs/>
-          <w:color w:val="2A2620"/>
-          <w:sz w:val="22"/>
-          <w:szCs w:val="22"/>
-        </w:rPr>
-        <w:t xml:space="preserve">Read the three new blog posts.</w:t>
+        <w:t xml:space="preserve">5.  </w:t>
+      </w:r>
+      <w:r>
+        <w:rPr>
+          <w:rFonts w:ascii="Calibri" w:cs="Calibri" w:eastAsia="Calibri" w:hAnsi="Calibri"/>
+          <w:b/>
+          <w:bCs/>
+          <w:color w:val="2A2620"/>
+          <w:sz w:val="22"/>
+          <w:szCs w:val="22"/>
+        </w:rPr>
+        <w:t xml:space="preserve">What is Emmy Laursen’s session fee?</w:t>
       </w:r>
     </w:p>
     <w:p>
@@ -483,7 +270,7 @@
           <w:sz w:val="19"/>
           <w:szCs w:val="19"/>
         </w:rPr>
-        <w:t xml:space="preserve">NEW. Trauma-informed supervision, equine therapy and insurance, and walk and talk therapy. They are live, they are in her voice and they make clinical claims.</w:t>
+        <w:t xml:space="preserve">She is the only associate whose card reads “Ask in the consult” in both columns. The rest of the roster reads $100 to $150. Her own profile page is now live, so the gap is more visible than it was.</w:t>
       </w:r>
     </w:p>
     <w:p>
@@ -501,18 +288,18 @@
           <w:sz w:val="22"/>
           <w:szCs w:val="22"/>
         </w:rPr>
-        <w:t xml:space="preserve">47.  </w:t>
-      </w:r>
-      <w:r>
-        <w:rPr>
-          <w:rFonts w:ascii="Calibri" w:cs="Calibri" w:eastAsia="Calibri" w:hAnsi="Calibri"/>
-          <w:b/>
-          <w:bCs/>
-          <w:color w:val="2A2620"/>
-          <w:sz w:val="22"/>
-          <w:szCs w:val="22"/>
-        </w:rPr>
-        <w:t xml:space="preserve">Review the new privacy policy page.</w:t>
+        <w:t xml:space="preserve">14.  </w:t>
+      </w:r>
+      <w:r>
+        <w:rPr>
+          <w:rFonts w:ascii="Calibri" w:cs="Calibri" w:eastAsia="Calibri" w:hAnsi="Calibri"/>
+          <w:b/>
+          <w:bCs/>
+          <w:color w:val="2A2620"/>
+          <w:sz w:val="22"/>
+          <w:szCs w:val="22"/>
+        </w:rPr>
+        <w:t xml:space="preserve">What is the next retreat date, format and fee?</w:t>
       </w:r>
     </w:p>
     <w:p>
@@ -529,7 +316,7 @@
           <w:sz w:val="19"/>
           <w:szCs w:val="19"/>
         </w:rPr>
-        <w:t xml:space="preserve">NEW. It covers the website only and says so, pointing clinical privacy at the Notice of Privacy Practices. The old 2020 PDF described Google Analytics and cookies, neither of which this site has, so it was not reusable.</w:t>
+        <w:t xml:space="preserve">Still blank. The retreats page sends people to the contact form instead of letting them book.</w:t>
       </w:r>
     </w:p>
     <w:p>
@@ -547,6 +334,282 @@
           <w:sz w:val="22"/>
           <w:szCs w:val="22"/>
         </w:rPr>
+        <w:t xml:space="preserve">15.  </w:t>
+      </w:r>
+      <w:r>
+        <w:rPr>
+          <w:rFonts w:ascii="Calibri" w:cs="Calibri" w:eastAsia="Calibri" w:hAnsi="Calibri"/>
+          <w:b/>
+          <w:bCs/>
+          <w:color w:val="2A2620"/>
+          <w:sz w:val="22"/>
+          <w:szCs w:val="22"/>
+        </w:rPr>
+        <w:t xml:space="preserve">What is the next ethics CEU offering — date and fee?</w:t>
+      </w:r>
+    </w:p>
+    <w:p>
+      <w:pPr>
+        <w:spacing w:after="60" w:line="264"/>
+        <w:ind w:left="470"/>
+      </w:pPr>
+      <w:r>
+        <w:rPr>
+          <w:rFonts w:ascii="Calibri" w:cs="Calibri" w:eastAsia="Calibri" w:hAnsi="Calibri"/>
+          <w:i/>
+          <w:iCs/>
+          <w:color w:val="5C5346"/>
+          <w:sz w:val="19"/>
+          <w:szCs w:val="19"/>
+        </w:rPr>
+        <w:t xml:space="preserve">Same page, same problem. This is the only thing standing between that page and a working Course listing in its structured data, which needs a date and a price to validate.</w:t>
+      </w:r>
+    </w:p>
+    <w:p>
+      <w:pPr>
+        <w:keepNext/>
+        <w:spacing w:after="40" w:before="200"/>
+        <w:ind w:left="470" w:hanging="470"/>
+      </w:pPr>
+      <w:r>
+        <w:rPr>
+          <w:rFonts w:ascii="Calibri" w:cs="Calibri" w:eastAsia="Calibri" w:hAnsi="Calibri"/>
+          <w:b/>
+          <w:bCs/>
+          <w:color w:val="7A5C1F"/>
+          <w:sz w:val="22"/>
+          <w:szCs w:val="22"/>
+        </w:rPr>
+        <w:t xml:space="preserve">43.  </w:t>
+      </w:r>
+      <w:r>
+        <w:rPr>
+          <w:rFonts w:ascii="Calibri" w:cs="Calibri" w:eastAsia="Calibri" w:hAnsi="Calibri"/>
+          <w:b/>
+          <w:bCs/>
+          <w:color w:val="2A2620"/>
+          <w:sz w:val="22"/>
+          <w:szCs w:val="22"/>
+        </w:rPr>
+        <w:t xml:space="preserve">Is the online ethics CEU delivered live, or as a recording?</w:t>
+      </w:r>
+    </w:p>
+    <w:p>
+      <w:pPr>
+        <w:spacing w:after="60" w:line="264"/>
+        <w:ind w:left="470"/>
+      </w:pPr>
+      <w:r>
+        <w:rPr>
+          <w:rFonts w:ascii="Calibri" w:cs="Calibri" w:eastAsia="Calibri" w:hAnsi="Calibri"/>
+          <w:i/>
+          <w:iCs/>
+          <w:color w:val="5C5346"/>
+          <w:sz w:val="19"/>
+          <w:szCs w:val="19"/>
+        </w:rPr>
+        <w:t xml:space="preserve">Under 22 TAC §681.140(h) self-study is capped at one hour per renewal period, and a recording counts as self-study while a live session does not. The site advises readers to ask this of any online CE. It should be able to answer it about Reem’s own.</w:t>
+      </w:r>
+    </w:p>
+    <w:p>
+      <w:pPr>
+        <w:keepNext/>
+        <w:spacing w:after="40" w:before="200"/>
+        <w:ind w:left="470" w:hanging="470"/>
+      </w:pPr>
+      <w:r>
+        <w:rPr>
+          <w:rFonts w:ascii="Calibri" w:cs="Calibri" w:eastAsia="Calibri" w:hAnsi="Calibri"/>
+          <w:b/>
+          <w:bCs/>
+          <w:color w:val="7A5C1F"/>
+          <w:sz w:val="22"/>
+          <w:szCs w:val="22"/>
+        </w:rPr>
+        <w:t xml:space="preserve">44.  </w:t>
+      </w:r>
+      <w:r>
+        <w:rPr>
+          <w:rFonts w:ascii="Calibri" w:cs="Calibri" w:eastAsia="Calibri" w:hAnsi="Calibri"/>
+          <w:b/>
+          <w:bCs/>
+          <w:color w:val="2A2620"/>
+          <w:sz w:val="22"/>
+          <w:szCs w:val="22"/>
+        </w:rPr>
+        <w:t xml:space="preserve">Does the practice issue superbills for equine clients?</w:t>
+      </w:r>
+    </w:p>
+    <w:p>
+      <w:pPr>
+        <w:spacing w:after="60" w:line="264"/>
+        <w:ind w:left="470"/>
+      </w:pPr>
+      <w:r>
+        <w:rPr>
+          <w:rFonts w:ascii="Calibri" w:cs="Calibri" w:eastAsia="Calibri" w:hAnsi="Calibri"/>
+          <w:i/>
+          <w:iCs/>
+          <w:color w:val="5C5346"/>
+          <w:sz w:val="19"/>
+          <w:szCs w:val="19"/>
+        </w:rPr>
+        <w:t xml:space="preserve">The blog post states plainly that equine sessions are not billed to insurance. If clients can still claim out of network with a superbill, that changes the answer usefully for a lot of people.</w:t>
+      </w:r>
+    </w:p>
+    <w:p>
+      <w:pPr>
+        <w:keepNext/>
+        <w:spacing w:after="40" w:before="200"/>
+        <w:ind w:left="470" w:hanging="470"/>
+      </w:pPr>
+      <w:r>
+        <w:rPr>
+          <w:rFonts w:ascii="Calibri" w:cs="Calibri" w:eastAsia="Calibri" w:hAnsi="Calibri"/>
+          <w:b/>
+          <w:bCs/>
+          <w:color w:val="7A5C1F"/>
+          <w:sz w:val="22"/>
+          <w:szCs w:val="22"/>
+        </w:rPr>
+        <w:t xml:space="preserve">45.  </w:t>
+      </w:r>
+      <w:r>
+        <w:rPr>
+          <w:rFonts w:ascii="Calibri" w:cs="Calibri" w:eastAsia="Calibri" w:hAnsi="Calibri"/>
+          <w:b/>
+          <w:bCs/>
+          <w:color w:val="2A2620"/>
+          <w:sz w:val="22"/>
+          <w:szCs w:val="22"/>
+        </w:rPr>
+        <w:t xml:space="preserve">Sign off the rebuilt Good Faith Estimate.</w:t>
+      </w:r>
+    </w:p>
+    <w:p>
+      <w:pPr>
+        <w:spacing w:after="60" w:line="264"/>
+        <w:ind w:left="470"/>
+      </w:pPr>
+      <w:r>
+        <w:rPr>
+          <w:rFonts w:ascii="Calibri" w:cs="Calibri" w:eastAsia="Calibri" w:hAnsi="Calibri"/>
+          <w:i/>
+          <w:iCs/>
+          <w:color w:val="5C5346"/>
+          <w:sz w:val="19"/>
+          <w:szCs w:val="19"/>
+        </w:rPr>
+        <w:t xml:space="preserve">Rebuilt at $240 per 50-minute session, with trail walk at $125 and equine at $185 to $240, the EIN removed, the date range left blank to fill per client, and the No Surprises Act dispute-rights section added, which the old one lacked entirely. One item needs her judgment rather than mine: the CPT code. The old document said 90837 in its header and 90834 in its body. 90834 covers 38 to 52 minutes, which is what a 50-minute session is, so that is what I used. It is a billing decision.</w:t>
+      </w:r>
+    </w:p>
+    <w:p>
+      <w:pPr>
+        <w:keepNext/>
+        <w:spacing w:after="40" w:before="200"/>
+        <w:ind w:left="470" w:hanging="470"/>
+      </w:pPr>
+      <w:r>
+        <w:rPr>
+          <w:rFonts w:ascii="Calibri" w:cs="Calibri" w:eastAsia="Calibri" w:hAnsi="Calibri"/>
+          <w:b/>
+          <w:bCs/>
+          <w:color w:val="7A5C1F"/>
+          <w:sz w:val="22"/>
+          <w:szCs w:val="22"/>
+        </w:rPr>
+        <w:t xml:space="preserve">46.  </w:t>
+      </w:r>
+      <w:r>
+        <w:rPr>
+          <w:rFonts w:ascii="Calibri" w:cs="Calibri" w:eastAsia="Calibri" w:hAnsi="Calibri"/>
+          <w:b/>
+          <w:bCs/>
+          <w:color w:val="2A2620"/>
+          <w:sz w:val="22"/>
+          <w:szCs w:val="22"/>
+        </w:rPr>
+        <w:t xml:space="preserve">Read the three blog posts.</w:t>
+      </w:r>
+    </w:p>
+    <w:p>
+      <w:pPr>
+        <w:spacing w:after="60" w:line="264"/>
+        <w:ind w:left="470"/>
+      </w:pPr>
+      <w:r>
+        <w:rPr>
+          <w:rFonts w:ascii="Calibri" w:cs="Calibri" w:eastAsia="Calibri" w:hAnsi="Calibri"/>
+          <w:i/>
+          <w:iCs/>
+          <w:color w:val="5C5346"/>
+          <w:sz w:val="19"/>
+          <w:szCs w:val="19"/>
+        </w:rPr>
+        <w:t xml:space="preserve">Trauma-informed supervision, equine therapy and insurance, and walk and talk therapy. They are live, they are in her voice and they make clinical claims.</w:t>
+      </w:r>
+    </w:p>
+    <w:p>
+      <w:pPr>
+        <w:keepNext/>
+        <w:spacing w:after="40" w:before="200"/>
+        <w:ind w:left="470" w:hanging="470"/>
+      </w:pPr>
+      <w:r>
+        <w:rPr>
+          <w:rFonts w:ascii="Calibri" w:cs="Calibri" w:eastAsia="Calibri" w:hAnsi="Calibri"/>
+          <w:b/>
+          <w:bCs/>
+          <w:color w:val="7A5C1F"/>
+          <w:sz w:val="22"/>
+          <w:szCs w:val="22"/>
+        </w:rPr>
+        <w:t xml:space="preserve">47.  </w:t>
+      </w:r>
+      <w:r>
+        <w:rPr>
+          <w:rFonts w:ascii="Calibri" w:cs="Calibri" w:eastAsia="Calibri" w:hAnsi="Calibri"/>
+          <w:b/>
+          <w:bCs/>
+          <w:color w:val="2A2620"/>
+          <w:sz w:val="22"/>
+          <w:szCs w:val="22"/>
+        </w:rPr>
+        <w:t xml:space="preserve">Review the privacy policy page.</w:t>
+      </w:r>
+    </w:p>
+    <w:p>
+      <w:pPr>
+        <w:spacing w:after="60" w:line="264"/>
+        <w:ind w:left="470"/>
+      </w:pPr>
+      <w:r>
+        <w:rPr>
+          <w:rFonts w:ascii="Calibri" w:cs="Calibri" w:eastAsia="Calibri" w:hAnsi="Calibri"/>
+          <w:i/>
+          <w:iCs/>
+          <w:color w:val="5C5346"/>
+          <w:sz w:val="19"/>
+          <w:szCs w:val="19"/>
+        </w:rPr>
+        <w:t xml:space="preserve">It covers the website only and says so, pointing clinical privacy at the Notice of Privacy Practices. One line changed this week: it no longer says that anything clinical belongs in the client portal, because there is no longer a portal on the site.</w:t>
+      </w:r>
+    </w:p>
+    <w:p>
+      <w:pPr>
+        <w:keepNext/>
+        <w:spacing w:after="40" w:before="200"/>
+        <w:ind w:left="470" w:hanging="470"/>
+      </w:pPr>
+      <w:r>
+        <w:rPr>
+          <w:rFonts w:ascii="Calibri" w:cs="Calibri" w:eastAsia="Calibri" w:hAnsi="Calibri"/>
+          <w:b/>
+          <w:bCs/>
+          <w:color w:val="7A5C1F"/>
+          <w:sz w:val="22"/>
+          <w:szCs w:val="22"/>
+        </w:rPr>
         <w:t xml:space="preserve">48.  </w:t>
       </w:r>
       <w:r>
@@ -575,7 +638,53 @@
           <w:sz w:val="19"/>
           <w:szCs w:val="19"/>
         </w:rPr>
-        <w:t xml:space="preserve">NEW. Trail walk at $125 for an hour now sits beside $240 for a 50-minute online session and $185 to $240 for equine. Trail walk is the cheapest hour on offer by a wide margin, and all three are visible side by side on the therapy page.</w:t>
+        <w:t xml:space="preserve">Trail walk at $125 for an hour sits beside $240 for a 50-minute online session and $185 to $240 for equine. Trail walk is the cheapest hour on offer by a wide margin, and all three are visible side by side on the therapy page. The FAQ fee list used to hide the equine price behind “additional fees apply”; it now states it, so the figure is public in five places and needs to be right.</w:t>
+      </w:r>
+    </w:p>
+    <w:p>
+      <w:pPr>
+        <w:keepNext/>
+        <w:spacing w:after="40" w:before="200"/>
+        <w:ind w:left="470" w:hanging="470"/>
+      </w:pPr>
+      <w:r>
+        <w:rPr>
+          <w:rFonts w:ascii="Calibri" w:cs="Calibri" w:eastAsia="Calibri" w:hAnsi="Calibri"/>
+          <w:b/>
+          <w:bCs/>
+          <w:color w:val="7A5C1F"/>
+          <w:sz w:val="22"/>
+          <w:szCs w:val="22"/>
+        </w:rPr>
+        <w:t xml:space="preserve">54.  </w:t>
+      </w:r>
+      <w:r>
+        <w:rPr>
+          <w:rFonts w:ascii="Calibri" w:cs="Calibri" w:eastAsia="Calibri" w:hAnsi="Calibri"/>
+          <w:b/>
+          <w:bCs/>
+          <w:color w:val="2A2620"/>
+          <w:sz w:val="22"/>
+          <w:szCs w:val="22"/>
+        </w:rPr>
+        <w:t xml:space="preserve">Should each associate approve their own page before it is promoted?</w:t>
+      </w:r>
+    </w:p>
+    <w:p>
+      <w:pPr>
+        <w:spacing w:after="60" w:line="264"/>
+        <w:ind w:left="470"/>
+      </w:pPr>
+      <w:r>
+        <w:rPr>
+          <w:rFonts w:ascii="Calibri" w:cs="Calibri" w:eastAsia="Calibri" w:hAnsi="Calibri"/>
+          <w:i/>
+          <w:iCs/>
+          <w:color w:val="5C5346"/>
+          <w:sz w:val="19"/>
+          <w:szCs w:val="19"/>
+        </w:rPr>
+        <w:t xml:space="preserve">NEW. All six now have a page of their own with a photograph, their bio in their own words, their fee, their focus areas and their direct email and phone. Nobody’s words were rewritten. But these are six other people’s professional reputations on a public site, and none of them has seen the page. Reem’s own entry is the exception: Dave asked for hers to be cleaned up, and it was.</w:t>
       </w:r>
     </w:p>
     <w:p>
@@ -641,7 +750,7 @@
           <w:sz w:val="19"/>
           <w:szCs w:val="19"/>
         </w:rPr>
-        <w:t xml:space="preserve">Pending permission. Four fields: the website, which likely still points at the old site; the address, where switching to a service area in Austin will probably trigger re-verification; the name, which must read Finding Balance Counseling with nothing appended; and the primary category, Counselor.</w:t>
+        <w:t xml:space="preserve">In progress. Four fields: the website, which likely still points at the old site; the address, where switching to a service area in Austin will probably trigger re-verification; the name, which must read Finding Balance Counseling with nothing appended; and the primary category, Counselor. Still the highest-leverage single item in either audit.</w:t>
       </w:r>
     </w:p>
     <w:p>
@@ -687,7 +796,7 @@
           <w:sz w:val="19"/>
           <w:szCs w:val="19"/>
         </w:rPr>
-        <w:t xml:space="preserve">EMDRIA and the NARM Training Institute are confirmed and wired into the schema. Still to check: Somatic Experiencing International, TherapyDen and GoodTherapy. The first of those matters most, because the structured data claims Somatic Experiencing Practitioner and nothing yet corroborates it.</w:t>
+        <w:t xml:space="preserve">EMDRIA and the NARM Training Institute are confirmed and wired into the schema. Still to check: Somatic Experiencing International, TherapyDen and GoodTherapy. The first matters most, because the structured data claims Somatic Experiencing Practitioner and nothing yet corroborates it.</w:t>
       </w:r>
     </w:p>
     <w:p>
@@ -705,18 +814,18 @@
           <w:sz w:val="22"/>
           <w:szCs w:val="22"/>
         </w:rPr>
-        <w:t xml:space="preserve">27.  </w:t>
-      </w:r>
-      <w:r>
-        <w:rPr>
-          <w:rFonts w:ascii="Calibri" w:cs="Calibri" w:eastAsia="Calibri" w:hAnsi="Calibri"/>
-          <w:b/>
-          <w:bCs/>
-          <w:color w:val="2A2620"/>
-          <w:sz w:val="22"/>
-          <w:szCs w:val="22"/>
-        </w:rPr>
-        <w:t xml:space="preserve">What is the client portal — which product, and what is the login URL?</w:t>
+        <w:t xml:space="preserve">49.  </w:t>
+      </w:r>
+      <w:r>
+        <w:rPr>
+          <w:rFonts w:ascii="Calibri" w:cs="Calibri" w:eastAsia="Calibri" w:hAnsi="Calibri"/>
+          <w:b/>
+          <w:bCs/>
+          <w:color w:val="2A2620"/>
+          <w:sz w:val="22"/>
+          <w:szCs w:val="22"/>
+        </w:rPr>
+        <w:t xml:space="preserve">When does findingbalancecounselingpllc.com redirect?</w:t>
       </w:r>
     </w:p>
     <w:p>
@@ -733,7 +842,7 @@
           <w:sz w:val="19"/>
           <w:szCs w:val="19"/>
         </w:rPr>
-        <w:t xml:space="preserve">Both settings are empty, so every portal button on the site is inert. Question 42 depends on this.</w:t>
+        <w:t xml:space="preserve">The old WordPress site is still live on that domain, serving outdated fees, the old roster and “coming soon” pages, and competing with the new site for the practice’s own name. Nothing is waiting on it except Reem’s approval of the new site. The domain itself stays registered, because the practice email runs on it.</w:t>
       </w:r>
     </w:p>
     <w:p>
@@ -751,18 +860,18 @@
           <w:sz w:val="22"/>
           <w:szCs w:val="22"/>
         </w:rPr>
-        <w:t xml:space="preserve">29.  </w:t>
-      </w:r>
-      <w:r>
-        <w:rPr>
-          <w:rFonts w:ascii="Calibri" w:cs="Calibri" w:eastAsia="Calibri" w:hAnsi="Calibri"/>
-          <w:b/>
-          <w:bCs/>
-          <w:color w:val="2A2620"/>
-          <w:sz w:val="22"/>
-          <w:szCs w:val="22"/>
-        </w:rPr>
-        <w:t xml:space="preserve">Is a higher-resolution photograph of Reem available?</w:t>
+        <w:t xml:space="preserve">42.  </w:t>
+      </w:r>
+      <w:r>
+        <w:rPr>
+          <w:rFonts w:ascii="Calibri" w:cs="Calibri" w:eastAsia="Calibri" w:hAnsi="Calibri"/>
+          <w:b/>
+          <w:bCs/>
+          <w:color w:val="2A2620"/>
+          <w:sz w:val="22"/>
+          <w:szCs w:val="22"/>
+        </w:rPr>
+        <w:t xml:space="preserve">How should the $85 retreat deposit be collected?</w:t>
       </w:r>
     </w:p>
     <w:p>
@@ -779,53 +888,7 @@
           <w:sz w:val="19"/>
           <w:szCs w:val="19"/>
         </w:rPr>
-        <w:t xml:space="preserve">Both copies are 320 by 400 pixels. A head-and-shoulders shot at 1200 pixels or more on the long edge would cover the About page portrait, which is still a watercolour, and the home page.</w:t>
-      </w:r>
-    </w:p>
-    <w:p>
-      <w:pPr>
-        <w:keepNext/>
-        <w:spacing w:after="40" w:before="200"/>
-        <w:ind w:left="470" w:hanging="470"/>
-      </w:pPr>
-      <w:r>
-        <w:rPr>
-          <w:rFonts w:ascii="Calibri" w:cs="Calibri" w:eastAsia="Calibri" w:hAnsi="Calibri"/>
-          <w:b/>
-          <w:bCs/>
-          <w:color w:val="7A5C1F"/>
-          <w:sz w:val="22"/>
-          <w:szCs w:val="22"/>
-        </w:rPr>
-        <w:t xml:space="preserve">49.  </w:t>
-      </w:r>
-      <w:r>
-        <w:rPr>
-          <w:rFonts w:ascii="Calibri" w:cs="Calibri" w:eastAsia="Calibri" w:hAnsi="Calibri"/>
-          <w:b/>
-          <w:bCs/>
-          <w:color w:val="2A2620"/>
-          <w:sz w:val="22"/>
-          <w:szCs w:val="22"/>
-        </w:rPr>
-        <w:t xml:space="preserve">When does findingbalancecounselingpllc.com redirect?</w:t>
-      </w:r>
-    </w:p>
-    <w:p>
-      <w:pPr>
-        <w:spacing w:after="60" w:line="264"/>
-        <w:ind w:left="470"/>
-      </w:pPr>
-      <w:r>
-        <w:rPr>
-          <w:rFonts w:ascii="Calibri" w:cs="Calibri" w:eastAsia="Calibri" w:hAnsi="Calibri"/>
-          <w:i/>
-          <w:iCs/>
-          <w:color w:val="5C5346"/>
-          <w:sz w:val="19"/>
-          <w:szCs w:val="19"/>
-        </w:rPr>
-        <w:t xml:space="preserve">NEW. The old WordPress site is still live on that domain, serving outdated fees, the old roster and “coming soon” pages, and competing with the new site for the practice’s own name. The intake PDFs are recovered, so nothing is waiting on it except Reem’s approval of the new site. The domain itself stays registered, because the practice email runs on it.</w:t>
+        <w:t xml:space="preserve">Reframed. It used to depend on the client portal; with the portal dropped, it needs a payment route of its own — a Stripe or Square link is the smallest thing that works, with a written refund policy and a receipt trail. Still a build rather than a copy change, and still blocked on question 14.</w:t>
       </w:r>
     </w:p>
     <w:p>
@@ -863,18 +926,18 @@
           <w:sz w:val="22"/>
           <w:szCs w:val="22"/>
         </w:rPr>
-        <w:t xml:space="preserve">33.  </w:t>
-      </w:r>
-      <w:r>
-        <w:rPr>
-          <w:rFonts w:ascii="Calibri" w:cs="Calibri" w:eastAsia="Calibri" w:hAnsi="Calibri"/>
-          <w:b/>
-          <w:bCs/>
-          <w:color w:val="2A2620"/>
-          <w:sz w:val="22"/>
-          <w:szCs w:val="22"/>
-        </w:rPr>
-        <w:t xml:space="preserve">Who should “Email Reem” go to on client-facing pages?</w:t>
+        <w:t xml:space="preserve">37.  </w:t>
+      </w:r>
+      <w:r>
+        <w:rPr>
+          <w:rFonts w:ascii="Calibri" w:cs="Calibri" w:eastAsia="Calibri" w:hAnsi="Calibri"/>
+          <w:b/>
+          <w:bCs/>
+          <w:color w:val="2A2620"/>
+          <w:sz w:val="22"/>
+          <w:szCs w:val="22"/>
+        </w:rPr>
+        <w:t xml:space="preserve">Can the built output be removed from version control?</w:t>
       </w:r>
     </w:p>
     <w:p>
@@ -891,7 +954,7 @@
           <w:sz w:val="19"/>
           <w:szCs w:val="19"/>
         </w:rPr>
-        <w:t xml:space="preserve">That button appears on 21 pages and points at the supervision address, which is a personal Gmail. The same now applies to the published phone number, and to the client forms, where I used the practice address rather than the Gmail.</w:t>
+        <w:t xml:space="preserve">Cloudflare rebuilds from source on push, so dist/ does not need to be tracked. 84 files are. The cache-busting hash sits in every page’s head, so one CSS change shows up as a 30-file diff. Related and quicker: the device mount reports every file as mode 755, so git currently sees a change on roughly 170 files that have not changed. “git config core.filemode false” in that repo stops it.</w:t>
       </w:r>
     </w:p>
     <w:p>
@@ -909,18 +972,18 @@
           <w:sz w:val="22"/>
           <w:szCs w:val="22"/>
         </w:rPr>
-        <w:t xml:space="preserve">37.  </w:t>
-      </w:r>
-      <w:r>
-        <w:rPr>
-          <w:rFonts w:ascii="Calibri" w:cs="Calibri" w:eastAsia="Calibri" w:hAnsi="Calibri"/>
-          <w:b/>
-          <w:bCs/>
-          <w:color w:val="2A2620"/>
-          <w:sz w:val="22"/>
-          <w:szCs w:val="22"/>
-        </w:rPr>
-        <w:t xml:space="preserve">Can the built output be removed from version control?</w:t>
+        <w:t xml:space="preserve">50.  </w:t>
+      </w:r>
+      <w:r>
+        <w:rPr>
+          <w:rFonts w:ascii="Calibri" w:cs="Calibri" w:eastAsia="Calibri" w:hAnsi="Calibri"/>
+          <w:b/>
+          <w:bCs/>
+          <w:color w:val="2A2620"/>
+          <w:sz w:val="22"/>
+          <w:szCs w:val="22"/>
+        </w:rPr>
+        <w:t xml:space="preserve">What happens to the logo?</w:t>
       </w:r>
     </w:p>
     <w:p>
@@ -937,7 +1000,7 @@
           <w:sz w:val="19"/>
           <w:szCs w:val="19"/>
         </w:rPr>
-        <w:t xml:space="preserve">Cloudflare rebuilds from source on push, so it does not need to be tracked. The cache-busting hash sits in every page’s head, so one CSS change shows up as a 30-file diff.</w:t>
+        <w:t xml:space="preserve">The second version is close: central Texas vegetation, the site’s own navy and brass, type set outside the circle. It is still a raster file whose lettering will not hold at favicon size, and the letterspacing in “COUNSELING, PLLC” is uneven. Options: use the circle alone as a graphic and keep the text wordmark, or have it redrawn as vector. The horse-head mark cut from the emblem is already serving as the tab icon.</w:t>
       </w:r>
     </w:p>
     <w:p>
@@ -955,18 +1018,18 @@
           <w:sz w:val="22"/>
           <w:szCs w:val="22"/>
         </w:rPr>
-        <w:t xml:space="preserve">50.  </w:t>
-      </w:r>
-      <w:r>
-        <w:rPr>
-          <w:rFonts w:ascii="Calibri" w:cs="Calibri" w:eastAsia="Calibri" w:hAnsi="Calibri"/>
-          <w:b/>
-          <w:bCs/>
-          <w:color w:val="2A2620"/>
-          <w:sz w:val="22"/>
-          <w:szCs w:val="22"/>
-        </w:rPr>
-        <w:t xml:space="preserve">What happens to the logo?</w:t>
+        <w:t xml:space="preserve">51.  </w:t>
+      </w:r>
+      <w:r>
+        <w:rPr>
+          <w:rFonts w:ascii="Calibri" w:cs="Calibri" w:eastAsia="Calibri" w:hAnsi="Calibri"/>
+          <w:b/>
+          <w:bCs/>
+          <w:color w:val="2A2620"/>
+          <w:sz w:val="22"/>
+          <w:szCs w:val="22"/>
+        </w:rPr>
+        <w:t xml:space="preserve">Soft graphics on the long pages?</w:t>
       </w:r>
     </w:p>
     <w:p>
@@ -983,53 +1046,7 @@
           <w:sz w:val="19"/>
           <w:szCs w:val="19"/>
         </w:rPr>
-        <w:t xml:space="preserve">NEW. The second version is close: central Texas vegetation, the site’s own navy and brass, type set outside the circle. It is still a raster file whose lettering will not hold at favicon size, and the letterspacing in “COUNSELING, PLLC” is uneven. Options: use the circle alone as a graphic and keep the text wordmark, or have it redrawn as vector.</w:t>
-      </w:r>
-    </w:p>
-    <w:p>
-      <w:pPr>
-        <w:keepNext/>
-        <w:spacing w:after="40" w:before="200"/>
-        <w:ind w:left="470" w:hanging="470"/>
-      </w:pPr>
-      <w:r>
-        <w:rPr>
-          <w:rFonts w:ascii="Calibri" w:cs="Calibri" w:eastAsia="Calibri" w:hAnsi="Calibri"/>
-          <w:b/>
-          <w:bCs/>
-          <w:color w:val="7A5C1F"/>
-          <w:sz w:val="22"/>
-          <w:szCs w:val="22"/>
-        </w:rPr>
-        <w:t xml:space="preserve">51.  </w:t>
-      </w:r>
-      <w:r>
-        <w:rPr>
-          <w:rFonts w:ascii="Calibri" w:cs="Calibri" w:eastAsia="Calibri" w:hAnsi="Calibri"/>
-          <w:b/>
-          <w:bCs/>
-          <w:color w:val="2A2620"/>
-          <w:sz w:val="22"/>
-          <w:szCs w:val="22"/>
-        </w:rPr>
-        <w:t xml:space="preserve">Soft graphics on the long pages?</w:t>
-      </w:r>
-    </w:p>
-    <w:p>
-      <w:pPr>
-        <w:spacing w:after="60" w:line="264"/>
-        <w:ind w:left="470"/>
-      </w:pPr>
-      <w:r>
-        <w:rPr>
-          <w:rFonts w:ascii="Calibri" w:cs="Calibri" w:eastAsia="Calibri" w:hAnsi="Calibri"/>
-          <w:i/>
-          <w:iCs/>
-          <w:color w:val="5C5346"/>
-          <w:sz w:val="19"/>
-          <w:szCs w:val="19"/>
-        </w:rPr>
-        <w:t xml:space="preserve">NEW. Twenty pages have no imagery at all, and the whole Approach section runs about 5,000 words across five pages without a single visual break. Six inline SVGs in the site palette would fix the worst of it. No effect on rankings.</w:t>
+        <w:t xml:space="preserve">The Approach section still runs about 5,000 words across five pages without a single visual break. The six associate photographs have improved the therapy and associates pages considerably, which is some evidence for doing the same elsewhere. No effect on rankings.</w:t>
       </w:r>
     </w:p>
     <w:p>
@@ -1091,7 +1108,7 @@
           <w:sz w:val="21"/>
           <w:szCs w:val="21"/>
         </w:rPr>
-        <w:t xml:space="preserve">The CE provider question is settled, and Reem was right</w:t>
+        <w:t xml:space="preserve">The client portal is gone from the site</w:t>
       </w:r>
     </w:p>
     <w:p>
@@ -1108,7 +1125,7 @@
           <w:sz w:val="19"/>
           <w:szCs w:val="19"/>
         </w:rPr>
-        <w:t xml:space="preserve">22 TAC §681.140(f)(6) lists “a licensee with supervisor status” as an acceptable provider, so her hours fill the approved half. §681.140(i) says the Council pre-approves nobody, so the provider number I asked for does not exist. Corrected on three pages, with the citation.</w:t>
+        <w:t xml:space="preserve">Question 27 was answered by deciding not to have one on the website. The /contact/client-portal/ page is deleted and 301s to /contact/, and every button, link and mention is removed from the forms page, the contact page, the appointment page, the privacy policy, each associate profile and the site configuration.</w:t>
       </w:r>
     </w:p>
     <w:p>
@@ -1136,7 +1153,7 @@
           <w:sz w:val="21"/>
           <w:szCs w:val="21"/>
         </w:rPr>
-        <w:t xml:space="preserve">Trail walk is $125 for one hour</w:t>
+        <w:t xml:space="preserve">All six associates have their own page</w:t>
       </w:r>
     </w:p>
     <w:p>
@@ -1153,7 +1170,7 @@
           <w:sz w:val="19"/>
           <w:szCs w:val="19"/>
         </w:rPr>
-        <w:t xml:space="preserve">Replaced the inherited $240 to $370 in fifteen places across seven pages, plus the Service schema and llms.txt.</w:t>
+        <w:t xml:space="preserve">Photograph, bio in their own words, fee, sliding scale, focus areas, and direct email and phone. The hub page keeps the summary table. Each page carries its own Person markup naming Reem as supervisor.</w:t>
       </w:r>
     </w:p>
     <w:p>
@@ -1181,7 +1198,7 @@
           <w:sz w:val="21"/>
           <w:szCs w:val="21"/>
         </w:rPr>
-        <w:t xml:space="preserve">Arizona is gone</w:t>
+        <w:t xml:space="preserve">The appointment form no longer invites clinical detail</w:t>
       </w:r>
     </w:p>
     <w:p>
@@ -1198,7 +1215,7 @@
           <w:sz w:val="19"/>
           <w:szCs w:val="19"/>
         </w:rPr>
-        <w:t xml:space="preserve">Removed from the served areas in the schema and from five telehealth answers. The site claims Texas only.</w:t>
+        <w:t xml:space="preserve">The open-ended “what brings you here” box is removed, “what are you looking for” is now free text rather than a menu, and the page warns twice, in plain words, against putting any personal information in an ordinary email.</w:t>
       </w:r>
     </w:p>
     <w:p>
@@ -1226,7 +1243,7 @@
           <w:sz w:val="21"/>
           <w:szCs w:val="21"/>
         </w:rPr>
-        <w:t xml:space="preserve">Two directory profiles are live in the schema</w:t>
+        <w:t xml:space="preserve">The therapy page gives the associates their own section</w:t>
       </w:r>
     </w:p>
     <w:p>
@@ -1243,7 +1260,7 @@
           <w:sz w:val="19"/>
           <w:szCs w:val="19"/>
         </w:rPr>
-        <w:t xml:space="preserve">EMDRIA and the NARM Training Institute. The NARM listing also corroborates the “NARM Therapist” credential the site claims.</w:t>
+        <w:t xml:space="preserve">The associates card was buried in a grid of presenting problems, which is a different question from who you see. It now has its own band directly after that grid, with all six faces linking to their pages.</w:t>
       </w:r>
     </w:p>
     <w:p>
@@ -1271,7 +1288,7 @@
           <w:sz w:val="21"/>
           <w:szCs w:val="21"/>
         </w:rPr>
-        <w:t xml:space="preserve">All five client forms are on the site</w:t>
+        <w:t xml:space="preserve">Supervisor since 2009, computed</w:t>
       </w:r>
     </w:p>
     <w:p>
@@ -1288,7 +1305,7 @@
           <w:sz w:val="19"/>
           <w:szCs w:val="19"/>
         </w:rPr>
-        <w:t xml:space="preserve">Four corrected, the Good Faith Estimate rebuilt. Cedar Park, the old phone number and the personal Gmail are gone from the letterhead.</w:t>
+        <w:t xml:space="preserve">The About and home pages read “2009, 17 years”, with the span calculated from the current year rather than typed, so it does not go stale every January.</w:t>
       </w:r>
     </w:p>
     <w:p>
@@ -1316,7 +1333,7 @@
           <w:sz w:val="21"/>
           <w:szCs w:val="21"/>
         </w:rPr>
-        <w:t xml:space="preserve">The privacy policy is a page, not a PDF</w:t>
+        <w:t xml:space="preserve">The equine fee is stated on the FAQ</w:t>
       </w:r>
     </w:p>
     <w:p>
@@ -1333,7 +1350,7 @@
           <w:sz w:val="19"/>
           <w:szCs w:val="19"/>
         </w:rPr>
-        <w:t xml:space="preserve">At /privacy/, written from how this site actually behaves. The old PDF path redirects to it.</w:t>
+        <w:t xml:space="preserve">It was the last page still saying “additional fees apply” while four others quoted $185 to $240. The FAQ is where people go for fees.</w:t>
       </w:r>
     </w:p>
     <w:p>
@@ -1361,7 +1378,7 @@
           <w:sz w:val="21"/>
           <w:szCs w:val="21"/>
         </w:rPr>
-        <w:t xml:space="preserve">preview.html was shipping</w:t>
+        <w:t xml:space="preserve">Reem’s portrait replaced the watercolour on the About page</w:t>
       </w:r>
     </w:p>
     <w:p>
@@ -1378,7 +1395,7 @@
           <w:sz w:val="19"/>
           <w:szCs w:val="19"/>
         </w:rPr>
-        <w:t xml:space="preserve">A 2.9MB public copy of the entire site, served at /preview.html against its own source comment. Now excluded from production builds.</w:t>
+        <w:t xml:space="preserve">621 by 785, which closes question 29.</w:t>
       </w:r>
     </w:p>
     <w:p>
@@ -1403,7 +1420,7 @@
           <w:sz w:val="28"/>
           <w:szCs w:val="28"/>
         </w:rPr>
-        <w:t xml:space="preserve">The three that block the most</w:t>
+        <w:t xml:space="preserve">The four that block the most</w:t>
       </w:r>
     </w:p>
     <w:tbl>
@@ -1499,6 +1516,154 @@
                 <w:szCs w:val="19"/>
               </w:rPr>
               <w:t xml:space="preserve">Owner</w:t>
+            </w:r>
+          </w:p>
+        </w:tc>
+      </w:tr>
+      <w:tr>
+        <w:tc>
+          <w:tcPr>
+            <w:tcW w:type="dxa" w:w="760"/>
+            <w:tcMar>
+              <w:top w:type="dxa" w:w="90"/>
+              <w:left w:type="dxa" w:w="120"/>
+              <w:bottom w:type="dxa" w:w="90"/>
+              <w:right w:type="dxa" w:w="120"/>
+            </w:tcMar>
+          </w:tcPr>
+          <w:p>
+            <w:r>
+              <w:rPr>
+                <w:rFonts w:ascii="Calibri" w:cs="Calibri" w:eastAsia="Calibri" w:hAnsi="Calibri"/>
+                <w:b/>
+                <w:bCs/>
+                <w:color w:val="7A5C1F"/>
+                <w:sz w:val="19"/>
+                <w:szCs w:val="19"/>
+              </w:rPr>
+              <w:t xml:space="preserve">52</w:t>
+            </w:r>
+          </w:p>
+        </w:tc>
+        <w:tc>
+          <w:tcPr>
+            <w:tcW w:type="dxa" w:w="6400"/>
+            <w:tcMar>
+              <w:top w:type="dxa" w:w="90"/>
+              <w:left w:type="dxa" w:w="120"/>
+              <w:bottom w:type="dxa" w:w="90"/>
+              <w:right w:type="dxa" w:w="120"/>
+            </w:tcMar>
+          </w:tcPr>
+          <w:p>
+            <w:r>
+              <w:rPr>
+                <w:rFonts w:ascii="Calibri" w:cs="Calibri" w:eastAsia="Calibri" w:hAnsi="Calibri"/>
+                <w:b w:val="false"/>
+                <w:bCs w:val="false"/>
+                <w:color w:val="2A2620"/>
+                <w:sz w:val="19"/>
+                <w:szCs w:val="19"/>
+              </w:rPr>
+              <w:t xml:space="preserve">Which email address client-facing pages use</w:t>
+            </w:r>
+          </w:p>
+        </w:tc>
+        <w:tc>
+          <w:tcPr>
+            <w:tcW w:type="dxa" w:w="1640"/>
+            <w:tcMar>
+              <w:top w:type="dxa" w:w="90"/>
+              <w:left w:type="dxa" w:w="120"/>
+              <w:bottom w:type="dxa" w:w="90"/>
+              <w:right w:type="dxa" w:w="120"/>
+            </w:tcMar>
+          </w:tcPr>
+          <w:p>
+            <w:r>
+              <w:rPr>
+                <w:rFonts w:ascii="Calibri" w:cs="Calibri" w:eastAsia="Calibri" w:hAnsi="Calibri"/>
+                <w:b w:val="false"/>
+                <w:bCs w:val="false"/>
+                <w:color w:val="2A2620"/>
+                <w:sz w:val="19"/>
+                <w:szCs w:val="19"/>
+              </w:rPr>
+              <w:t xml:space="preserve">Reem</w:t>
+            </w:r>
+          </w:p>
+        </w:tc>
+      </w:tr>
+      <w:tr>
+        <w:tc>
+          <w:tcPr>
+            <w:tcW w:type="dxa" w:w="760"/>
+            <w:tcMar>
+              <w:top w:type="dxa" w:w="90"/>
+              <w:left w:type="dxa" w:w="120"/>
+              <w:bottom w:type="dxa" w:w="90"/>
+              <w:right w:type="dxa" w:w="120"/>
+            </w:tcMar>
+          </w:tcPr>
+          <w:p>
+            <w:r>
+              <w:rPr>
+                <w:rFonts w:ascii="Calibri" w:cs="Calibri" w:eastAsia="Calibri" w:hAnsi="Calibri"/>
+                <w:b/>
+                <w:bCs/>
+                <w:color w:val="7A5C1F"/>
+                <w:sz w:val="19"/>
+                <w:szCs w:val="19"/>
+              </w:rPr>
+              <w:t xml:space="preserve">54</w:t>
+            </w:r>
+          </w:p>
+        </w:tc>
+        <w:tc>
+          <w:tcPr>
+            <w:tcW w:type="dxa" w:w="6400"/>
+            <w:tcMar>
+              <w:top w:type="dxa" w:w="90"/>
+              <w:left w:type="dxa" w:w="120"/>
+              <w:bottom w:type="dxa" w:w="90"/>
+              <w:right w:type="dxa" w:w="120"/>
+            </w:tcMar>
+          </w:tcPr>
+          <w:p>
+            <w:r>
+              <w:rPr>
+                <w:rFonts w:ascii="Calibri" w:cs="Calibri" w:eastAsia="Calibri" w:hAnsi="Calibri"/>
+                <w:b w:val="false"/>
+                <w:bCs w:val="false"/>
+                <w:color w:val="2A2620"/>
+                <w:sz w:val="19"/>
+                <w:szCs w:val="19"/>
+              </w:rPr>
+              <w:t xml:space="preserve">Associates approve their own pages</w:t>
+            </w:r>
+          </w:p>
+        </w:tc>
+        <w:tc>
+          <w:tcPr>
+            <w:tcW w:type="dxa" w:w="1640"/>
+            <w:tcMar>
+              <w:top w:type="dxa" w:w="90"/>
+              <w:left w:type="dxa" w:w="120"/>
+              <w:bottom w:type="dxa" w:w="90"/>
+              <w:right w:type="dxa" w:w="120"/>
+            </w:tcMar>
+          </w:tcPr>
+          <w:p>
+            <w:r>
+              <w:rPr>
+                <w:rFonts w:ascii="Calibri" w:cs="Calibri" w:eastAsia="Calibri" w:hAnsi="Calibri"/>
+                <w:b w:val="false"/>
+                <w:bCs w:val="false"/>
+                <w:color w:val="2A2620"/>
+                <w:sz w:val="19"/>
+                <w:szCs w:val="19"/>
+              </w:rPr>
+              <w:t xml:space="preserve">Reem</w:t>
             </w:r>
           </w:p>
         </w:tc>
@@ -1651,80 +1816,6 @@
           </w:p>
         </w:tc>
       </w:tr>
-      <w:tr>
-        <w:tc>
-          <w:tcPr>
-            <w:tcW w:type="dxa" w:w="760"/>
-            <w:tcMar>
-              <w:top w:type="dxa" w:w="90"/>
-              <w:left w:type="dxa" w:w="120"/>
-              <w:bottom w:type="dxa" w:w="90"/>
-              <w:right w:type="dxa" w:w="120"/>
-            </w:tcMar>
-          </w:tcPr>
-          <w:p>
-            <w:r>
-              <w:rPr>
-                <w:rFonts w:ascii="Calibri" w:cs="Calibri" w:eastAsia="Calibri" w:hAnsi="Calibri"/>
-                <w:b/>
-                <w:bCs/>
-                <w:color w:val="7A5C1F"/>
-                <w:sz w:val="19"/>
-                <w:szCs w:val="19"/>
-              </w:rPr>
-              <w:t xml:space="preserve">27</w:t>
-            </w:r>
-          </w:p>
-        </w:tc>
-        <w:tc>
-          <w:tcPr>
-            <w:tcW w:type="dxa" w:w="6400"/>
-            <w:tcMar>
-              <w:top w:type="dxa" w:w="90"/>
-              <w:left w:type="dxa" w:w="120"/>
-              <w:bottom w:type="dxa" w:w="90"/>
-              <w:right w:type="dxa" w:w="120"/>
-            </w:tcMar>
-          </w:tcPr>
-          <w:p>
-            <w:r>
-              <w:rPr>
-                <w:rFonts w:ascii="Calibri" w:cs="Calibri" w:eastAsia="Calibri" w:hAnsi="Calibri"/>
-                <w:b w:val="false"/>
-                <w:bCs w:val="false"/>
-                <w:color w:val="2A2620"/>
-                <w:sz w:val="19"/>
-                <w:szCs w:val="19"/>
-              </w:rPr>
-              <w:t xml:space="preserve">Client portal product and URL</w:t>
-            </w:r>
-          </w:p>
-        </w:tc>
-        <w:tc>
-          <w:tcPr>
-            <w:tcW w:type="dxa" w:w="1640"/>
-            <w:tcMar>
-              <w:top w:type="dxa" w:w="90"/>
-              <w:left w:type="dxa" w:w="120"/>
-              <w:bottom w:type="dxa" w:w="90"/>
-              <w:right w:type="dxa" w:w="120"/>
-            </w:tcMar>
-          </w:tcPr>
-          <w:p>
-            <w:r>
-              <w:rPr>
-                <w:rFonts w:ascii="Calibri" w:cs="Calibri" w:eastAsia="Calibri" w:hAnsi="Calibri"/>
-                <w:b w:val="false"/>
-                <w:bCs w:val="false"/>
-                <w:color w:val="2A2620"/>
-                <w:sz w:val="19"/>
-                <w:szCs w:val="19"/>
-              </w:rPr>
-              <w:t xml:space="preserve">Dave</w:t>
-            </w:r>
-          </w:p>
-        </w:tc>
-      </w:tr>
     </w:tbl>
     <w:p>
       <w:pPr>
@@ -1739,7 +1830,7 @@
           <w:sz w:val="19"/>
           <w:szCs w:val="19"/>
         </w:rPr>
-        <w:t xml:space="preserve">15 unblocks a page and its structured data. 23 is still the highest-leverage single item in either audit. 27 turns on every portal button on the site and is what question 42 is waiting for.</w:t>
+        <w:t xml:space="preserve">52 is a one-line fix waiting on one answer, and it is wrong on 26 pages until then. 54 is six other people’s reputations published without their sign-off. 15 unblocks a page and its structured data. 23 remains the highest-leverage single item in either audit.</w:t>
       </w:r>
     </w:p>
     <w:sectPr>

</xml_diff>